<commit_message>
Interactive Overview mini-table + opportunity detail modal
- KPIs and charts now filter a mini-table on the Overview in place (no tab jump),
  with a clearable filter pill and "View all in Opportunities" hand-off.
- Replace the inline Word link with a click-to-open detail modal: descriptor,
  due date, funder-site link, summary, and a 2-sentence "How this applies to
  Proud Ground" note (new pg_application field on every grant).
- Word summary: curated grants link their pre-built .docx; auto/federal grants
  generate a Word doc client-side from current data (always reflects refresh).
- build_docs.js adds a "How This Applies to Proud Ground" section.

Co-Authored-By: Claude Opus 4.8 <noreply@anthropic.com>
</commit_message>
<xml_diff>
--- a/docs/grant-summaries/bofa-neighborhood-builders-2027.docx
+++ b/docs/grant-summaries/bofa-neighborhood-builders-2027.docx
@@ -444,6 +444,23 @@
         <w:pStyle w:val="Heading2"/>
       </w:pPr>
       <w:r>
+        <w:t xml:space="preserve">How This Applies to Proud Ground</w:t>
+      </w:r>
+    </w:p>
+    <w:p>
+      <w:r>
+        <w:rPr>
+          <w:sz w:val="22"/>
+          <w:szCs w:val="22"/>
+        </w:rPr>
+        <w:t xml:space="preserve">Neighborhood Builders pairs flexible capacity funding with leadership development for the executive director and an emerging leader, supporting Proud Ground's long-term organizational resilience. It is best pursued as an investment in leadership succession and unrestricted capacity rather than a specific housing project.</w:t>
+      </w:r>
+    </w:p>
+    <w:p>
+      <w:pPr>
+        <w:pStyle w:val="Heading2"/>
+      </w:pPr>
+      <w:r>
         <w:t xml:space="preserve">Application Checklist — What You’ll Need</w:t>
       </w:r>
     </w:p>
@@ -530,7 +547,7 @@
         </w:rPr>
         <w:t xml:space="preserve">Official funder page: </w:t>
       </w:r>
-      <w:hyperlink w:history="1" r:id="rIdkaatasfqq3d2c_is0lbls">
+      <w:hyperlink w:history="1" r:id="rIdvw4fs7ztcdrmqo7jcvhaz">
         <w:r>
           <w:rPr>
             <w:rStyle w:val="Hyperlink"/>

</xml_diff>